<commit_message>
Add second ChatGPT transcript link to AI Usage doc
Co-Authored-By: Claude Opus 5 <noreply@anthropic.com>
</commit_message>
<xml_diff>
--- a/Part 3 - AI Usage.docx
+++ b/Part 3 - AI Usage.docx
@@ -375,6 +375,12 @@
               <w:t xml:space="preserve">Competitor positioning analysis, client FAQ framing
 https://chatgpt.com/share/6aa93281-6108-83ee-bd6b-681a3b0937f6</w:t>
             </w:r>
+            <w:r>
+              <w:br/>
+            </w:r>
+            <w:r>
+              <w:t>https://chatgpt.com/share/6aa94139-cb20-83ee-9432-6d0cc981c84c</w:t>
+            </w:r>
           </w:p>
         </w:tc>
         <w:tc>

</xml_diff>